<commit_message>
Restructure report template (Part A pre-build / Part B post-build), formal booking message, no em dashes
Co-Authored-By: Claude Fable 5 <noreply@anthropic.com>
</commit_message>
<xml_diff>
--- a/docs/student-materials/Project-Report-Template.docx
+++ b/docs/student-materials/Project-Report-Template.docx
@@ -4,7 +4,7 @@
   <w:body>
     <w:p>
       <w:pPr>
-        <w:spacing w:after="60" w:before="500"/>
+        <w:spacing w:after="60" w:before="400"/>
         <w:jc w:val="center"/>
       </w:pPr>
       <w:r>
@@ -42,7 +42,7 @@
         <w:pBdr>
           <w:bottom w:val="single" w:color="4263A6" w:sz="8" w:space="10"/>
         </w:pBdr>
-        <w:spacing w:after="700"/>
+        <w:spacing w:after="600"/>
         <w:jc w:val="center"/>
       </w:pPr>
       <w:r>
@@ -51,7 +51,7 @@
           <w:sz w:val="22"/>
           <w:szCs w:val="22"/>
         </w:rPr>
-        <w:t xml:space="preserve">Android Application Development — Training Program</w:t>
+        <w:t xml:space="preserve">Android Application Development · Training Program</w:t>
       </w:r>
     </w:p>
     <w:p>
@@ -72,7 +72,7 @@
     </w:p>
     <w:p>
       <w:pPr>
-        <w:spacing w:after="640"/>
+        <w:spacing w:after="420"/>
         <w:jc w:val="center"/>
       </w:pPr>
       <w:r>
@@ -83,7 +83,25 @@
           <w:sz w:val="22"/>
           <w:szCs w:val="22"/>
         </w:rPr>
-        <w:t xml:space="preserve">(API-Integrated Android App built with Kotlin &amp; Retrofit)</w:t>
+        <w:t xml:space="preserve">(API-Integrated Android App built with Kotlin and Retrofit)</w:t>
+      </w:r>
+    </w:p>
+    <w:p>
+      <w:pPr>
+        <w:spacing w:after="420"/>
+        <w:jc w:val="center"/>
+      </w:pPr>
+      <w:r>
+        <w:rPr>
+          <w:b/>
+          <w:bCs/>
+          <w:i/>
+          <w:iCs/>
+          <w:color w:val="B8860B"/>
+          <w:sz w:val="21"/>
+          <w:szCs w:val="21"/>
+        </w:rPr>
+        <w:t xml:space="preserve">Part A (Pages 1 and 2): submit BEFORE starting development · Part B (Pages 3 and 4): complete with the final submission</w:t>
       </w:r>
     </w:p>
     <w:p>
@@ -99,7 +117,7 @@
           <w:sz w:val="24"/>
           <w:szCs w:val="24"/>
         </w:rPr>
-        <w:t xml:space="preserve">Project Title:  </w:t>
+        <w:t xml:space="preserve">Project Title (as booked):  </w:t>
       </w:r>
       <w:r>
         <w:rPr>
@@ -108,7 +126,7 @@
           <w:szCs w:val="24"/>
           <w:u w:val="single"/>
         </w:rPr>
-        <w:t xml:space="preserve">                                        </w:t>
+        <w:t xml:space="preserve">                                  </w:t>
       </w:r>
     </w:p>
     <w:p>
@@ -138,7 +156,7 @@
     </w:p>
     <w:p>
       <w:pPr>
-        <w:spacing w:after="420"/>
+        <w:spacing w:after="320"/>
       </w:pPr>
     </w:p>
     <w:p>
@@ -279,7 +297,7 @@
           <w:sz w:val="24"/>
           <w:szCs w:val="24"/>
         </w:rPr>
-        <w:t xml:space="preserve">Date of Submission:  </w:t>
+        <w:t xml:space="preserve">Date of Submission (Part A):  </w:t>
       </w:r>
       <w:r>
         <w:rPr>
@@ -288,7 +306,7 @@
           <w:szCs w:val="24"/>
           <w:u w:val="single"/>
         </w:rPr>
-        <w:t xml:space="preserve">                                    </w:t>
+        <w:t xml:space="preserve">                              </w:t>
       </w:r>
     </w:p>
     <w:p>
@@ -298,27 +316,24 @@
     </w:p>
     <w:p>
       <w:pPr>
-        <w:pStyle w:val="Heading1"/>
-        <w:pBdr>
+        <w:pBdr>
+          <w:top w:val="single" w:color="5B7CC4" w:sz="6" w:space="4"/>
           <w:bottom w:val="single" w:color="5B7CC4" w:sz="6" w:space="4"/>
         </w:pBdr>
-        <w:spacing w:after="120" w:before="300"/>
+        <w:shd w:fill="EEF1F9" w:val="clear"/>
+        <w:spacing w:after="220" w:before="60"/>
+        <w:jc w:val="center"/>
       </w:pPr>
       <w:r>
         <w:rPr>
           <w:b/>
           <w:bCs/>
           <w:color w:val="4263A6"/>
-          <w:sz w:val="28"/>
-          <w:szCs w:val="28"/>
-        </w:rPr>
-        <w:t xml:space="preserve">1. Introduction &amp; Objective</w:t>
-      </w:r>
-    </w:p>
-    <w:p>
-      <w:pPr>
-        <w:spacing w:after="140"/>
-      </w:pPr>
+          <w:sz w:val="25"/>
+          <w:szCs w:val="25"/>
+        </w:rPr>
+        <w:t xml:space="preserve">  PART A · PRE-BUILD  </w:t>
+      </w:r>
       <w:r>
         <w:rPr>
           <w:i/>
@@ -327,67 +342,7 @@
           <w:sz w:val="21"/>
           <w:szCs w:val="21"/>
         </w:rPr>
-        <w:t xml:space="preserve">3–4 sentences only: what your app does, who would use it, and why you picked this project. No history of Android, no filler.</w:t>
-      </w:r>
-    </w:p>
-    <w:p>
-      <w:pPr>
-        <w:pBdr>
-          <w:bottom w:val="single" w:color="C8CEDA" w:sz="4" w:space="1"/>
-        </w:pBdr>
-        <w:spacing w:after="300"/>
-      </w:pPr>
-      <w:r>
-        <w:rPr>
-          <w:sz w:val="22"/>
-          <w:szCs w:val="22"/>
-        </w:rPr>
-        <w:t xml:space="preserve"> </w:t>
-      </w:r>
-    </w:p>
-    <w:p>
-      <w:pPr>
-        <w:pBdr>
-          <w:bottom w:val="single" w:color="C8CEDA" w:sz="4" w:space="1"/>
-        </w:pBdr>
-        <w:spacing w:after="300"/>
-      </w:pPr>
-      <w:r>
-        <w:rPr>
-          <w:sz w:val="22"/>
-          <w:szCs w:val="22"/>
-        </w:rPr>
-        <w:t xml:space="preserve"> </w:t>
-      </w:r>
-    </w:p>
-    <w:p>
-      <w:pPr>
-        <w:pBdr>
-          <w:bottom w:val="single" w:color="C8CEDA" w:sz="4" w:space="1"/>
-        </w:pBdr>
-        <w:spacing w:after="300"/>
-      </w:pPr>
-      <w:r>
-        <w:rPr>
-          <w:sz w:val="22"/>
-          <w:szCs w:val="22"/>
-        </w:rPr>
-        <w:t xml:space="preserve"> </w:t>
-      </w:r>
-    </w:p>
-    <w:p>
-      <w:pPr>
-        <w:pBdr>
-          <w:bottom w:val="single" w:color="C8CEDA" w:sz="4" w:space="1"/>
-        </w:pBdr>
-        <w:spacing w:after="300"/>
-      </w:pPr>
-      <w:r>
-        <w:rPr>
-          <w:sz w:val="22"/>
-          <w:szCs w:val="22"/>
-        </w:rPr>
-        <w:t xml:space="preserve"> </w:t>
+        <w:t xml:space="preserve">·  Fill this page before writing any code. It is your plan.  </w:t>
       </w:r>
     </w:p>
     <w:p>
@@ -396,7 +351,7 @@
         <w:pBdr>
           <w:bottom w:val="single" w:color="5B7CC4" w:sz="6" w:space="4"/>
         </w:pBdr>
-        <w:spacing w:after="120" w:before="300"/>
+        <w:spacing w:after="120" w:before="280"/>
       </w:pPr>
       <w:r>
         <w:rPr>
@@ -406,7 +361,7 @@
           <w:sz w:val="28"/>
           <w:szCs w:val="28"/>
         </w:rPr>
-        <w:t xml:space="preserve">2. About the API</w:t>
+        <w:t xml:space="preserve">1. Introduction &amp; Objective</w:t>
       </w:r>
     </w:p>
     <w:p>
@@ -421,82 +376,67 @@
           <w:sz w:val="21"/>
           <w:szCs w:val="21"/>
         </w:rPr>
-        <w:t xml:space="preserve">The API name and base URL, the exact endpoint(s) you call, whether it needs a key, and the 3–4 response fields your app actually uses.</w:t>
-      </w:r>
-    </w:p>
-    <w:p>
-      <w:pPr>
-        <w:pBdr>
-          <w:bottom w:val="single" w:color="C8CEDA" w:sz="4" w:space="1"/>
-        </w:pBdr>
-        <w:spacing w:after="300"/>
-      </w:pPr>
-      <w:r>
-        <w:rPr>
-          <w:sz w:val="22"/>
-          <w:szCs w:val="22"/>
-        </w:rPr>
-        <w:t xml:space="preserve"> </w:t>
-      </w:r>
-    </w:p>
-    <w:p>
-      <w:pPr>
-        <w:pBdr>
-          <w:bottom w:val="single" w:color="C8CEDA" w:sz="4" w:space="1"/>
-        </w:pBdr>
-        <w:spacing w:after="300"/>
-      </w:pPr>
-      <w:r>
-        <w:rPr>
-          <w:sz w:val="22"/>
-          <w:szCs w:val="22"/>
-        </w:rPr>
-        <w:t xml:space="preserve"> </w:t>
-      </w:r>
-    </w:p>
-    <w:p>
-      <w:pPr>
-        <w:pBdr>
-          <w:bottom w:val="single" w:color="C8CEDA" w:sz="4" w:space="1"/>
-        </w:pBdr>
-        <w:spacing w:after="300"/>
-      </w:pPr>
-      <w:r>
-        <w:rPr>
-          <w:sz w:val="22"/>
-          <w:szCs w:val="22"/>
-        </w:rPr>
-        <w:t xml:space="preserve"> </w:t>
-      </w:r>
-    </w:p>
-    <w:p>
-      <w:pPr>
-        <w:pBdr>
-          <w:bottom w:val="single" w:color="C8CEDA" w:sz="4" w:space="1"/>
-        </w:pBdr>
-        <w:spacing w:after="300"/>
-      </w:pPr>
-      <w:r>
-        <w:rPr>
-          <w:sz w:val="22"/>
-          <w:szCs w:val="22"/>
-        </w:rPr>
-        <w:t xml:space="preserve"> </w:t>
-      </w:r>
-    </w:p>
-    <w:p>
-      <w:pPr>
-        <w:pBdr>
-          <w:bottom w:val="single" w:color="C8CEDA" w:sz="4" w:space="1"/>
-        </w:pBdr>
-        <w:spacing w:after="300"/>
-      </w:pPr>
-      <w:r>
-        <w:rPr>
-          <w:sz w:val="22"/>
-          <w:szCs w:val="22"/>
-        </w:rPr>
-        <w:t xml:space="preserve"> </w:t>
+        <w:t xml:space="preserve">3 to 4 sentences only: what your app will do, who would use it, and why you chose this project. No filler.</w:t>
+      </w:r>
+    </w:p>
+    <w:p>
+      <w:pPr>
+        <w:pBdr>
+          <w:bottom w:val="single" w:color="C8CEDA" w:sz="4" w:space="1"/>
+        </w:pBdr>
+        <w:spacing w:after="300"/>
+      </w:pPr>
+      <w:r>
+        <w:rPr>
+          <w:sz w:val="22"/>
+          <w:szCs w:val="22"/>
+        </w:rPr>
+        <w:t xml:space="preserve"> </w:t>
+      </w:r>
+    </w:p>
+    <w:p>
+      <w:pPr>
+        <w:pBdr>
+          <w:bottom w:val="single" w:color="C8CEDA" w:sz="4" w:space="1"/>
+        </w:pBdr>
+        <w:spacing w:after="300"/>
+      </w:pPr>
+      <w:r>
+        <w:rPr>
+          <w:sz w:val="22"/>
+          <w:szCs w:val="22"/>
+        </w:rPr>
+        <w:t xml:space="preserve"> </w:t>
+      </w:r>
+    </w:p>
+    <w:p>
+      <w:pPr>
+        <w:pBdr>
+          <w:bottom w:val="single" w:color="C8CEDA" w:sz="4" w:space="1"/>
+        </w:pBdr>
+        <w:spacing w:after="300"/>
+      </w:pPr>
+      <w:r>
+        <w:rPr>
+          <w:sz w:val="22"/>
+          <w:szCs w:val="22"/>
+        </w:rPr>
+        <w:t xml:space="preserve"> </w:t>
+      </w:r>
+    </w:p>
+    <w:p>
+      <w:pPr>
+        <w:pBdr>
+          <w:bottom w:val="single" w:color="C8CEDA" w:sz="4" w:space="1"/>
+        </w:pBdr>
+        <w:spacing w:after="300"/>
+      </w:pPr>
+      <w:r>
+        <w:rPr>
+          <w:sz w:val="22"/>
+          <w:szCs w:val="22"/>
+        </w:rPr>
+        <w:t xml:space="preserve"> </w:t>
       </w:r>
     </w:p>
     <w:p>
@@ -505,7 +445,7 @@
         <w:pBdr>
           <w:bottom w:val="single" w:color="5B7CC4" w:sz="6" w:space="4"/>
         </w:pBdr>
-        <w:spacing w:after="120" w:before="300"/>
+        <w:spacing w:after="120" w:before="280"/>
       </w:pPr>
       <w:r>
         <w:rPr>
@@ -515,7 +455,7 @@
           <w:sz w:val="28"/>
           <w:szCs w:val="28"/>
         </w:rPr>
-        <w:t xml:space="preserve">3. App Features</w:t>
+        <w:t xml:space="preserve">2. About the API</w:t>
       </w:r>
     </w:p>
     <w:p>
@@ -530,7 +470,116 @@
           <w:sz w:val="21"/>
           <w:szCs w:val="21"/>
         </w:rPr>
-        <w:t xml:space="preserve">4–6 bullet points. Each one a real, working feature a user can see — not “used Retrofit” (that goes in Section 4).</w:t>
+        <w:t xml:space="preserve">The API name and base URL, the exact endpoint(s) you plan to call, whether it needs a key, and the 3 to 4 response fields your app will use.</w:t>
+      </w:r>
+    </w:p>
+    <w:p>
+      <w:pPr>
+        <w:pBdr>
+          <w:bottom w:val="single" w:color="C8CEDA" w:sz="4" w:space="1"/>
+        </w:pBdr>
+        <w:spacing w:after="300"/>
+      </w:pPr>
+      <w:r>
+        <w:rPr>
+          <w:sz w:val="22"/>
+          <w:szCs w:val="22"/>
+        </w:rPr>
+        <w:t xml:space="preserve"> </w:t>
+      </w:r>
+    </w:p>
+    <w:p>
+      <w:pPr>
+        <w:pBdr>
+          <w:bottom w:val="single" w:color="C8CEDA" w:sz="4" w:space="1"/>
+        </w:pBdr>
+        <w:spacing w:after="300"/>
+      </w:pPr>
+      <w:r>
+        <w:rPr>
+          <w:sz w:val="22"/>
+          <w:szCs w:val="22"/>
+        </w:rPr>
+        <w:t xml:space="preserve"> </w:t>
+      </w:r>
+    </w:p>
+    <w:p>
+      <w:pPr>
+        <w:pBdr>
+          <w:bottom w:val="single" w:color="C8CEDA" w:sz="4" w:space="1"/>
+        </w:pBdr>
+        <w:spacing w:after="300"/>
+      </w:pPr>
+      <w:r>
+        <w:rPr>
+          <w:sz w:val="22"/>
+          <w:szCs w:val="22"/>
+        </w:rPr>
+        <w:t xml:space="preserve"> </w:t>
+      </w:r>
+    </w:p>
+    <w:p>
+      <w:pPr>
+        <w:pBdr>
+          <w:bottom w:val="single" w:color="C8CEDA" w:sz="4" w:space="1"/>
+        </w:pBdr>
+        <w:spacing w:after="300"/>
+      </w:pPr>
+      <w:r>
+        <w:rPr>
+          <w:sz w:val="22"/>
+          <w:szCs w:val="22"/>
+        </w:rPr>
+        <w:t xml:space="preserve"> </w:t>
+      </w:r>
+    </w:p>
+    <w:p>
+      <w:pPr>
+        <w:pBdr>
+          <w:bottom w:val="single" w:color="C8CEDA" w:sz="4" w:space="1"/>
+        </w:pBdr>
+        <w:spacing w:after="300"/>
+      </w:pPr>
+      <w:r>
+        <w:rPr>
+          <w:sz w:val="22"/>
+          <w:szCs w:val="22"/>
+        </w:rPr>
+        <w:t xml:space="preserve"> </w:t>
+      </w:r>
+    </w:p>
+    <w:p>
+      <w:pPr>
+        <w:pStyle w:val="Heading1"/>
+        <w:pBdr>
+          <w:bottom w:val="single" w:color="5B7CC4" w:sz="6" w:space="4"/>
+        </w:pBdr>
+        <w:spacing w:after="120" w:before="280"/>
+      </w:pPr>
+      <w:r>
+        <w:rPr>
+          <w:b/>
+          <w:bCs/>
+          <w:color w:val="4263A6"/>
+          <w:sz w:val="28"/>
+          <w:szCs w:val="28"/>
+        </w:rPr>
+        <w:t xml:space="preserve">3. Planned Features</w:t>
+      </w:r>
+    </w:p>
+    <w:p>
+      <w:pPr>
+        <w:spacing w:after="140"/>
+      </w:pPr>
+      <w:r>
+        <w:rPr>
+          <w:i/>
+          <w:iCs/>
+          <w:color w:val="5A6478"/>
+          <w:sz w:val="21"/>
+          <w:szCs w:val="21"/>
+        </w:rPr>
+        <w:t xml:space="preserve">4 to 6 bullet points. Each one a concrete feature a user will see in the finished app, not internals like "use Retrofit".</w:t>
       </w:r>
     </w:p>
     <w:p>
@@ -550,7 +599,7 @@
           <w:sz w:val="22"/>
           <w:szCs w:val="22"/>
         </w:rPr>
-        <w:t xml:space="preserve"> </w:t>
+        <w:t xml:space="preserve"> </w:t>
       </w:r>
     </w:p>
     <w:p>
@@ -570,7 +619,7 @@
           <w:sz w:val="22"/>
           <w:szCs w:val="22"/>
         </w:rPr>
-        <w:t xml:space="preserve"> </w:t>
+        <w:t xml:space="preserve"> </w:t>
       </w:r>
     </w:p>
     <w:p>
@@ -590,7 +639,7 @@
           <w:sz w:val="22"/>
           <w:szCs w:val="22"/>
         </w:rPr>
-        <w:t xml:space="preserve"> </w:t>
+        <w:t xml:space="preserve"> </w:t>
       </w:r>
     </w:p>
     <w:p>
@@ -610,7 +659,7 @@
           <w:sz w:val="22"/>
           <w:szCs w:val="22"/>
         </w:rPr>
-        <w:t xml:space="preserve"> </w:t>
+        <w:t xml:space="preserve"> </w:t>
       </w:r>
     </w:p>
     <w:p>
@@ -630,7 +679,7 @@
           <w:sz w:val="22"/>
           <w:szCs w:val="22"/>
         </w:rPr>
-        <w:t xml:space="preserve"> </w:t>
+        <w:t xml:space="preserve"> </w:t>
       </w:r>
     </w:p>
     <w:p>
@@ -640,27 +689,24 @@
     </w:p>
     <w:p>
       <w:pPr>
-        <w:pStyle w:val="Heading1"/>
-        <w:pBdr>
+        <w:pBdr>
+          <w:top w:val="single" w:color="5B7CC4" w:sz="6" w:space="4"/>
           <w:bottom w:val="single" w:color="5B7CC4" w:sz="6" w:space="4"/>
         </w:pBdr>
-        <w:spacing w:after="120" w:before="300"/>
+        <w:shd w:fill="EEF1F9" w:val="clear"/>
+        <w:spacing w:after="220" w:before="60"/>
+        <w:jc w:val="center"/>
       </w:pPr>
       <w:r>
         <w:rPr>
           <w:b/>
           <w:bCs/>
           <w:color w:val="4263A6"/>
-          <w:sz w:val="28"/>
-          <w:szCs w:val="28"/>
-        </w:rPr>
-        <w:t xml:space="preserve">4. Implementation Overview</w:t>
-      </w:r>
-    </w:p>
-    <w:p>
-      <w:pPr>
-        <w:spacing w:after="140"/>
-      </w:pPr>
+          <w:sz w:val="25"/>
+          <w:szCs w:val="25"/>
+        </w:rPr>
+        <w:t xml:space="preserve">  PART B · POST-BUILD  </w:t>
+      </w:r>
       <w:r>
         <w:rPr>
           <w:i/>
@@ -669,97 +715,7 @@
           <w:sz w:val="21"/>
           <w:szCs w:val="21"/>
         </w:rPr>
-        <w:t xml:space="preserve">How the app is built, in one short paragraph + bullets: Retrofit interface &amp; data classes, how the UI shows loading / success / error states, and any libraries used (Compose, Coil, etc.). Keep it to half a page.</w:t>
-      </w:r>
-    </w:p>
-    <w:p>
-      <w:pPr>
-        <w:pBdr>
-          <w:bottom w:val="single" w:color="C8CEDA" w:sz="4" w:space="1"/>
-        </w:pBdr>
-        <w:spacing w:after="300"/>
-      </w:pPr>
-      <w:r>
-        <w:rPr>
-          <w:sz w:val="22"/>
-          <w:szCs w:val="22"/>
-        </w:rPr>
-        <w:t xml:space="preserve"> </w:t>
-      </w:r>
-    </w:p>
-    <w:p>
-      <w:pPr>
-        <w:pBdr>
-          <w:bottom w:val="single" w:color="C8CEDA" w:sz="4" w:space="1"/>
-        </w:pBdr>
-        <w:spacing w:after="300"/>
-      </w:pPr>
-      <w:r>
-        <w:rPr>
-          <w:sz w:val="22"/>
-          <w:szCs w:val="22"/>
-        </w:rPr>
-        <w:t xml:space="preserve"> </w:t>
-      </w:r>
-    </w:p>
-    <w:p>
-      <w:pPr>
-        <w:pBdr>
-          <w:bottom w:val="single" w:color="C8CEDA" w:sz="4" w:space="1"/>
-        </w:pBdr>
-        <w:spacing w:after="300"/>
-      </w:pPr>
-      <w:r>
-        <w:rPr>
-          <w:sz w:val="22"/>
-          <w:szCs w:val="22"/>
-        </w:rPr>
-        <w:t xml:space="preserve"> </w:t>
-      </w:r>
-    </w:p>
-    <w:p>
-      <w:pPr>
-        <w:pBdr>
-          <w:bottom w:val="single" w:color="C8CEDA" w:sz="4" w:space="1"/>
-        </w:pBdr>
-        <w:spacing w:after="300"/>
-      </w:pPr>
-      <w:r>
-        <w:rPr>
-          <w:sz w:val="22"/>
-          <w:szCs w:val="22"/>
-        </w:rPr>
-        <w:t xml:space="preserve"> </w:t>
-      </w:r>
-    </w:p>
-    <w:p>
-      <w:pPr>
-        <w:pBdr>
-          <w:bottom w:val="single" w:color="C8CEDA" w:sz="4" w:space="1"/>
-        </w:pBdr>
-        <w:spacing w:after="300"/>
-      </w:pPr>
-      <w:r>
-        <w:rPr>
-          <w:sz w:val="22"/>
-          <w:szCs w:val="22"/>
-        </w:rPr>
-        <w:t xml:space="preserve"> </w:t>
-      </w:r>
-    </w:p>
-    <w:p>
-      <w:pPr>
-        <w:pBdr>
-          <w:bottom w:val="single" w:color="C8CEDA" w:sz="4" w:space="1"/>
-        </w:pBdr>
-        <w:spacing w:after="300"/>
-      </w:pPr>
-      <w:r>
-        <w:rPr>
-          <w:sz w:val="22"/>
-          <w:szCs w:val="22"/>
-        </w:rPr>
-        <w:t xml:space="preserve"> </w:t>
+        <w:t xml:space="preserve">·  Fill pages 3 and 4 after your app is working.  </w:t>
       </w:r>
     </w:p>
     <w:p>
@@ -768,7 +724,7 @@
         <w:pBdr>
           <w:bottom w:val="single" w:color="5B7CC4" w:sz="6" w:space="4"/>
         </w:pBdr>
-        <w:spacing w:after="120" w:before="300"/>
+        <w:spacing w:after="120" w:before="280"/>
       </w:pPr>
       <w:r>
         <w:rPr>
@@ -778,7 +734,7 @@
           <w:sz w:val="28"/>
           <w:szCs w:val="28"/>
         </w:rPr>
-        <w:t xml:space="preserve">5. Screenshots</w:t>
+        <w:t xml:space="preserve">4. Implementation Overview</w:t>
       </w:r>
     </w:p>
     <w:p>
@@ -793,7 +749,116 @@
           <w:sz w:val="21"/>
           <w:szCs w:val="21"/>
         </w:rPr>
-        <w:t xml:space="preserve">Paste 2–4 screenshots of the running app with a one-line caption each (home screen, result screen, error state). Resize them to fit this page.</w:t>
+        <w:t xml:space="preserve">How the app is actually built, in one short paragraph plus bullets: Retrofit interface and data classes, how the UI shows loading, success and error states, and any libraries used (Compose, Coil, etc.). Note anything that changed from the Part A plan.</w:t>
+      </w:r>
+    </w:p>
+    <w:p>
+      <w:pPr>
+        <w:pBdr>
+          <w:bottom w:val="single" w:color="C8CEDA" w:sz="4" w:space="1"/>
+        </w:pBdr>
+        <w:spacing w:after="300"/>
+      </w:pPr>
+      <w:r>
+        <w:rPr>
+          <w:sz w:val="22"/>
+          <w:szCs w:val="22"/>
+        </w:rPr>
+        <w:t xml:space="preserve"> </w:t>
+      </w:r>
+    </w:p>
+    <w:p>
+      <w:pPr>
+        <w:pBdr>
+          <w:bottom w:val="single" w:color="C8CEDA" w:sz="4" w:space="1"/>
+        </w:pBdr>
+        <w:spacing w:after="300"/>
+      </w:pPr>
+      <w:r>
+        <w:rPr>
+          <w:sz w:val="22"/>
+          <w:szCs w:val="22"/>
+        </w:rPr>
+        <w:t xml:space="preserve"> </w:t>
+      </w:r>
+    </w:p>
+    <w:p>
+      <w:pPr>
+        <w:pBdr>
+          <w:bottom w:val="single" w:color="C8CEDA" w:sz="4" w:space="1"/>
+        </w:pBdr>
+        <w:spacing w:after="300"/>
+      </w:pPr>
+      <w:r>
+        <w:rPr>
+          <w:sz w:val="22"/>
+          <w:szCs w:val="22"/>
+        </w:rPr>
+        <w:t xml:space="preserve"> </w:t>
+      </w:r>
+    </w:p>
+    <w:p>
+      <w:pPr>
+        <w:pBdr>
+          <w:bottom w:val="single" w:color="C8CEDA" w:sz="4" w:space="1"/>
+        </w:pBdr>
+        <w:spacing w:after="300"/>
+      </w:pPr>
+      <w:r>
+        <w:rPr>
+          <w:sz w:val="22"/>
+          <w:szCs w:val="22"/>
+        </w:rPr>
+        <w:t xml:space="preserve"> </w:t>
+      </w:r>
+    </w:p>
+    <w:p>
+      <w:pPr>
+        <w:pBdr>
+          <w:bottom w:val="single" w:color="C8CEDA" w:sz="4" w:space="1"/>
+        </w:pBdr>
+        <w:spacing w:after="300"/>
+      </w:pPr>
+      <w:r>
+        <w:rPr>
+          <w:sz w:val="22"/>
+          <w:szCs w:val="22"/>
+        </w:rPr>
+        <w:t xml:space="preserve"> </w:t>
+      </w:r>
+    </w:p>
+    <w:p>
+      <w:pPr>
+        <w:pStyle w:val="Heading1"/>
+        <w:pBdr>
+          <w:bottom w:val="single" w:color="5B7CC4" w:sz="6" w:space="4"/>
+        </w:pBdr>
+        <w:spacing w:after="120" w:before="280"/>
+      </w:pPr>
+      <w:r>
+        <w:rPr>
+          <w:b/>
+          <w:bCs/>
+          <w:color w:val="4263A6"/>
+          <w:sz w:val="28"/>
+          <w:szCs w:val="28"/>
+        </w:rPr>
+        <w:t xml:space="preserve">5. Screenshots</w:t>
+      </w:r>
+    </w:p>
+    <w:p>
+      <w:pPr>
+        <w:spacing w:after="140"/>
+      </w:pPr>
+      <w:r>
+        <w:rPr>
+          <w:i/>
+          <w:iCs/>
+          <w:color w:val="5A6478"/>
+          <w:sz w:val="21"/>
+          <w:szCs w:val="21"/>
+        </w:rPr>
+        <w:t xml:space="preserve">Paste 2 to 4 screenshots of the running app with a one-line caption each (home screen, result screen, error state). Resize them to fit this page.</w:t>
       </w:r>
     </w:p>
     <w:tbl>
@@ -818,7 +883,7 @@
             <w:tcW w:type="dxa" w:w="4590"/>
             <w:shd w:fill="F2F4FA" w:val="clear"/>
             <w:tcMar>
-              <w:top w:type="dxa" w:w="2200"/>
+              <w:top w:type="dxa" w:w="2000"/>
               <w:left w:type="dxa" w:w="120"/>
               <w:bottom w:type="dxa" w:w="120"/>
               <w:right w:type="dxa" w:w="120"/>
@@ -836,7 +901,7 @@
                 <w:sz w:val="20"/>
                 <w:szCs w:val="20"/>
               </w:rPr>
-              <w:t xml:space="preserve">Screenshot 1 — caption</w:t>
+              <w:t xml:space="preserve">Screenshot 1 · caption</w:t>
             </w:r>
           </w:p>
         </w:tc>
@@ -845,7 +910,7 @@
             <w:tcW w:type="dxa" w:w="4590"/>
             <w:shd w:fill="F2F4FA" w:val="clear"/>
             <w:tcMar>
-              <w:top w:type="dxa" w:w="2200"/>
+              <w:top w:type="dxa" w:w="2000"/>
               <w:left w:type="dxa" w:w="120"/>
               <w:bottom w:type="dxa" w:w="120"/>
               <w:right w:type="dxa" w:w="120"/>
@@ -863,7 +928,7 @@
                 <w:sz w:val="20"/>
                 <w:szCs w:val="20"/>
               </w:rPr>
-              <w:t xml:space="preserve">Screenshot 2 — caption</w:t>
+              <w:t xml:space="preserve">Screenshot 2 · caption</w:t>
             </w:r>
           </w:p>
         </w:tc>
@@ -874,7 +939,7 @@
             <w:tcW w:type="dxa" w:w="4590"/>
             <w:shd w:fill="F2F4FA" w:val="clear"/>
             <w:tcMar>
-              <w:top w:type="dxa" w:w="2200"/>
+              <w:top w:type="dxa" w:w="2000"/>
               <w:left w:type="dxa" w:w="120"/>
               <w:bottom w:type="dxa" w:w="120"/>
               <w:right w:type="dxa" w:w="120"/>
@@ -892,7 +957,7 @@
                 <w:sz w:val="20"/>
                 <w:szCs w:val="20"/>
               </w:rPr>
-              <w:t xml:space="preserve">Screenshot 3 — caption</w:t>
+              <w:t xml:space="preserve">Screenshot 3 · caption</w:t>
             </w:r>
           </w:p>
         </w:tc>
@@ -901,7 +966,7 @@
             <w:tcW w:type="dxa" w:w="4590"/>
             <w:shd w:fill="F2F4FA" w:val="clear"/>
             <w:tcMar>
-              <w:top w:type="dxa" w:w="2200"/>
+              <w:top w:type="dxa" w:w="2000"/>
               <w:left w:type="dxa" w:w="120"/>
               <w:bottom w:type="dxa" w:w="120"/>
               <w:right w:type="dxa" w:w="120"/>
@@ -919,7 +984,7 @@
                 <w:sz w:val="20"/>
                 <w:szCs w:val="20"/>
               </w:rPr>
-              <w:t xml:space="preserve">Screenshot 4 — caption</w:t>
+              <w:t xml:space="preserve">Screenshot 4 · caption</w:t>
             </w:r>
           </w:p>
         </w:tc>
@@ -936,7 +1001,7 @@
         <w:pBdr>
           <w:bottom w:val="single" w:color="5B7CC4" w:sz="6" w:space="4"/>
         </w:pBdr>
-        <w:spacing w:after="120" w:before="300"/>
+        <w:spacing w:after="120" w:before="280"/>
       </w:pPr>
       <w:r>
         <w:rPr>
@@ -961,82 +1026,82 @@
           <w:sz w:val="21"/>
           <w:szCs w:val="21"/>
         </w:rPr>
-        <w:t xml:space="preserve">2–3 honest points: what broke, how you fixed it, and what you understand now that you didn’t before (JSON parsing, error handling, API limits…).</w:t>
-      </w:r>
-    </w:p>
-    <w:p>
-      <w:pPr>
-        <w:pBdr>
-          <w:bottom w:val="single" w:color="C8CEDA" w:sz="4" w:space="1"/>
-        </w:pBdr>
-        <w:spacing w:after="300"/>
-      </w:pPr>
-      <w:r>
-        <w:rPr>
-          <w:sz w:val="22"/>
-          <w:szCs w:val="22"/>
-        </w:rPr>
-        <w:t xml:space="preserve"> </w:t>
-      </w:r>
-    </w:p>
-    <w:p>
-      <w:pPr>
-        <w:pBdr>
-          <w:bottom w:val="single" w:color="C8CEDA" w:sz="4" w:space="1"/>
-        </w:pBdr>
-        <w:spacing w:after="300"/>
-      </w:pPr>
-      <w:r>
-        <w:rPr>
-          <w:sz w:val="22"/>
-          <w:szCs w:val="22"/>
-        </w:rPr>
-        <w:t xml:space="preserve"> </w:t>
-      </w:r>
-    </w:p>
-    <w:p>
-      <w:pPr>
-        <w:pBdr>
-          <w:bottom w:val="single" w:color="C8CEDA" w:sz="4" w:space="1"/>
-        </w:pBdr>
-        <w:spacing w:after="300"/>
-      </w:pPr>
-      <w:r>
-        <w:rPr>
-          <w:sz w:val="22"/>
-          <w:szCs w:val="22"/>
-        </w:rPr>
-        <w:t xml:space="preserve"> </w:t>
-      </w:r>
-    </w:p>
-    <w:p>
-      <w:pPr>
-        <w:pBdr>
-          <w:bottom w:val="single" w:color="C8CEDA" w:sz="4" w:space="1"/>
-        </w:pBdr>
-        <w:spacing w:after="300"/>
-      </w:pPr>
-      <w:r>
-        <w:rPr>
-          <w:sz w:val="22"/>
-          <w:szCs w:val="22"/>
-        </w:rPr>
-        <w:t xml:space="preserve"> </w:t>
-      </w:r>
-    </w:p>
-    <w:p>
-      <w:pPr>
-        <w:pBdr>
-          <w:bottom w:val="single" w:color="C8CEDA" w:sz="4" w:space="1"/>
-        </w:pBdr>
-        <w:spacing w:after="300"/>
-      </w:pPr>
-      <w:r>
-        <w:rPr>
-          <w:sz w:val="22"/>
-          <w:szCs w:val="22"/>
-        </w:rPr>
-        <w:t xml:space="preserve"> </w:t>
+        <w:t xml:space="preserve">2 to 3 honest points: what broke, how you fixed it, and what you understand now that you did not before (JSON parsing, error handling, API limits...).</w:t>
+      </w:r>
+    </w:p>
+    <w:p>
+      <w:pPr>
+        <w:pBdr>
+          <w:bottom w:val="single" w:color="C8CEDA" w:sz="4" w:space="1"/>
+        </w:pBdr>
+        <w:spacing w:after="300"/>
+      </w:pPr>
+      <w:r>
+        <w:rPr>
+          <w:sz w:val="22"/>
+          <w:szCs w:val="22"/>
+        </w:rPr>
+        <w:t xml:space="preserve"> </w:t>
+      </w:r>
+    </w:p>
+    <w:p>
+      <w:pPr>
+        <w:pBdr>
+          <w:bottom w:val="single" w:color="C8CEDA" w:sz="4" w:space="1"/>
+        </w:pBdr>
+        <w:spacing w:after="300"/>
+      </w:pPr>
+      <w:r>
+        <w:rPr>
+          <w:sz w:val="22"/>
+          <w:szCs w:val="22"/>
+        </w:rPr>
+        <w:t xml:space="preserve"> </w:t>
+      </w:r>
+    </w:p>
+    <w:p>
+      <w:pPr>
+        <w:pBdr>
+          <w:bottom w:val="single" w:color="C8CEDA" w:sz="4" w:space="1"/>
+        </w:pBdr>
+        <w:spacing w:after="300"/>
+      </w:pPr>
+      <w:r>
+        <w:rPr>
+          <w:sz w:val="22"/>
+          <w:szCs w:val="22"/>
+        </w:rPr>
+        <w:t xml:space="preserve"> </w:t>
+      </w:r>
+    </w:p>
+    <w:p>
+      <w:pPr>
+        <w:pBdr>
+          <w:bottom w:val="single" w:color="C8CEDA" w:sz="4" w:space="1"/>
+        </w:pBdr>
+        <w:spacing w:after="300"/>
+      </w:pPr>
+      <w:r>
+        <w:rPr>
+          <w:sz w:val="22"/>
+          <w:szCs w:val="22"/>
+        </w:rPr>
+        <w:t xml:space="preserve"> </w:t>
+      </w:r>
+    </w:p>
+    <w:p>
+      <w:pPr>
+        <w:pBdr>
+          <w:bottom w:val="single" w:color="C8CEDA" w:sz="4" w:space="1"/>
+        </w:pBdr>
+        <w:spacing w:after="300"/>
+      </w:pPr>
+      <w:r>
+        <w:rPr>
+          <w:sz w:val="22"/>
+          <w:szCs w:val="22"/>
+        </w:rPr>
+        <w:t xml:space="preserve"> </w:t>
       </w:r>
     </w:p>
     <w:p>
@@ -1045,7 +1110,7 @@
         <w:pBdr>
           <w:bottom w:val="single" w:color="5B7CC4" w:sz="6" w:space="4"/>
         </w:pBdr>
-        <w:spacing w:after="120" w:before="300"/>
+        <w:spacing w:after="120" w:before="280"/>
       </w:pPr>
       <w:r>
         <w:rPr>
@@ -1070,52 +1135,52 @@
           <w:sz w:val="21"/>
           <w:szCs w:val="21"/>
         </w:rPr>
-        <w:t xml:space="preserve">2–3 sentences: does the app meet the objective from Section 1, and what one improvement would you make next?</w:t>
-      </w:r>
-    </w:p>
-    <w:p>
-      <w:pPr>
-        <w:pBdr>
-          <w:bottom w:val="single" w:color="C8CEDA" w:sz="4" w:space="1"/>
-        </w:pBdr>
-        <w:spacing w:after="300"/>
-      </w:pPr>
-      <w:r>
-        <w:rPr>
-          <w:sz w:val="22"/>
-          <w:szCs w:val="22"/>
-        </w:rPr>
-        <w:t xml:space="preserve"> </w:t>
-      </w:r>
-    </w:p>
-    <w:p>
-      <w:pPr>
-        <w:pBdr>
-          <w:bottom w:val="single" w:color="C8CEDA" w:sz="4" w:space="1"/>
-        </w:pBdr>
-        <w:spacing w:after="300"/>
-      </w:pPr>
-      <w:r>
-        <w:rPr>
-          <w:sz w:val="22"/>
-          <w:szCs w:val="22"/>
-        </w:rPr>
-        <w:t xml:space="preserve"> </w:t>
-      </w:r>
-    </w:p>
-    <w:p>
-      <w:pPr>
-        <w:pBdr>
-          <w:bottom w:val="single" w:color="C8CEDA" w:sz="4" w:space="1"/>
-        </w:pBdr>
-        <w:spacing w:after="300"/>
-      </w:pPr>
-      <w:r>
-        <w:rPr>
-          <w:sz w:val="22"/>
-          <w:szCs w:val="22"/>
-        </w:rPr>
-        <w:t xml:space="preserve"> </w:t>
+        <w:t xml:space="preserve">2 to 3 sentences: does the finished app meet the objective from Section 1, and what one improvement would you make next?</w:t>
+      </w:r>
+    </w:p>
+    <w:p>
+      <w:pPr>
+        <w:pBdr>
+          <w:bottom w:val="single" w:color="C8CEDA" w:sz="4" w:space="1"/>
+        </w:pBdr>
+        <w:spacing w:after="300"/>
+      </w:pPr>
+      <w:r>
+        <w:rPr>
+          <w:sz w:val="22"/>
+          <w:szCs w:val="22"/>
+        </w:rPr>
+        <w:t xml:space="preserve"> </w:t>
+      </w:r>
+    </w:p>
+    <w:p>
+      <w:pPr>
+        <w:pBdr>
+          <w:bottom w:val="single" w:color="C8CEDA" w:sz="4" w:space="1"/>
+        </w:pBdr>
+        <w:spacing w:after="300"/>
+      </w:pPr>
+      <w:r>
+        <w:rPr>
+          <w:sz w:val="22"/>
+          <w:szCs w:val="22"/>
+        </w:rPr>
+        <w:t xml:space="preserve"> </w:t>
+      </w:r>
+    </w:p>
+    <w:p>
+      <w:pPr>
+        <w:pBdr>
+          <w:bottom w:val="single" w:color="C8CEDA" w:sz="4" w:space="1"/>
+        </w:pBdr>
+        <w:spacing w:after="300"/>
+      </w:pPr>
+      <w:r>
+        <w:rPr>
+          <w:sz w:val="22"/>
+          <w:szCs w:val="22"/>
+        </w:rPr>
+        <w:t xml:space="preserve"> </w:t>
       </w:r>
     </w:p>
     <w:p>
@@ -1124,7 +1189,7 @@
         <w:pBdr>
           <w:bottom w:val="single" w:color="5B7CC4" w:sz="6" w:space="4"/>
         </w:pBdr>
-        <w:spacing w:after="120" w:before="300"/>
+        <w:spacing w:after="120" w:before="280"/>
       </w:pPr>
       <w:r>
         <w:rPr>
@@ -1164,57 +1229,57 @@
           <w:sz w:val="22"/>
           <w:szCs w:val="22"/>
         </w:rPr>
-        <w:t xml:space="preserve"> </w:t>
-      </w:r>
-    </w:p>
-    <w:p>
-      <w:pPr>
-        <w:pBdr>
-          <w:bottom w:val="single" w:color="C8CEDA" w:sz="4" w:space="1"/>
-        </w:pBdr>
-        <w:spacing w:after="300"/>
-      </w:pPr>
-      <w:r>
-        <w:rPr>
-          <w:sz w:val="22"/>
-          <w:szCs w:val="22"/>
-        </w:rPr>
-        <w:t xml:space="preserve"> </w:t>
-      </w:r>
-    </w:p>
-    <w:p>
-      <w:pPr>
-        <w:pBdr>
-          <w:bottom w:val="single" w:color="C8CEDA" w:sz="4" w:space="1"/>
-        </w:pBdr>
-        <w:spacing w:after="300"/>
-      </w:pPr>
-      <w:r>
-        <w:rPr>
-          <w:sz w:val="22"/>
-          <w:szCs w:val="22"/>
-        </w:rPr>
-        <w:t xml:space="preserve"> </w:t>
-      </w:r>
-    </w:p>
-    <w:p>
-      <w:pPr>
-        <w:pBdr>
-          <w:bottom w:val="single" w:color="C8CEDA" w:sz="4" w:space="1"/>
-        </w:pBdr>
-        <w:spacing w:after="300"/>
-      </w:pPr>
-      <w:r>
-        <w:rPr>
-          <w:sz w:val="22"/>
-          <w:szCs w:val="22"/>
-        </w:rPr>
-        <w:t xml:space="preserve"> </w:t>
-      </w:r>
-    </w:p>
-    <w:p>
-      <w:pPr>
-        <w:spacing w:before="360"/>
+        <w:t xml:space="preserve"> </w:t>
+      </w:r>
+    </w:p>
+    <w:p>
+      <w:pPr>
+        <w:pBdr>
+          <w:bottom w:val="single" w:color="C8CEDA" w:sz="4" w:space="1"/>
+        </w:pBdr>
+        <w:spacing w:after="300"/>
+      </w:pPr>
+      <w:r>
+        <w:rPr>
+          <w:sz w:val="22"/>
+          <w:szCs w:val="22"/>
+        </w:rPr>
+        <w:t xml:space="preserve"> </w:t>
+      </w:r>
+    </w:p>
+    <w:p>
+      <w:pPr>
+        <w:pBdr>
+          <w:bottom w:val="single" w:color="C8CEDA" w:sz="4" w:space="1"/>
+        </w:pBdr>
+        <w:spacing w:after="300"/>
+      </w:pPr>
+      <w:r>
+        <w:rPr>
+          <w:sz w:val="22"/>
+          <w:szCs w:val="22"/>
+        </w:rPr>
+        <w:t xml:space="preserve"> </w:t>
+      </w:r>
+    </w:p>
+    <w:p>
+      <w:pPr>
+        <w:pBdr>
+          <w:bottom w:val="single" w:color="C8CEDA" w:sz="4" w:space="1"/>
+        </w:pBdr>
+        <w:spacing w:after="300"/>
+      </w:pPr>
+      <w:r>
+        <w:rPr>
+          <w:sz w:val="22"/>
+          <w:szCs w:val="22"/>
+        </w:rPr>
+        <w:t xml:space="preserve"> </w:t>
+      </w:r>
+    </w:p>
+    <w:p>
+      <w:pPr>
+        <w:spacing w:before="300"/>
         <w:jc w:val="center"/>
       </w:pPr>
       <w:r>
@@ -1292,7 +1357,7 @@
         <w:sz w:val="18"/>
         <w:szCs w:val="18"/>
       </w:rPr>
-      <w:t xml:space="preserve">Humble Coders · Android App Development · Project Report — Page </w:t>
+      <w:t xml:space="preserve">Humble Coders · Android App Development · Project Report · Page </w:t>
     </w:r>
     <w:r>
       <w:rPr>

</xml_diff>